<commit_message>
feat: rebrand project from Kyamatu to Matundu and replace KyamaBot with MatunduBot.
</commit_message>
<xml_diff>
--- a/docs/1_Proposal_Document.docx
+++ b/docs/1_Proposal_Document.docx
@@ -17,7 +17,7 @@
           <w:b/>
           <w:sz w:val="32"/>
         </w:rPr>
-        <w:t>SCHOOL MANAGEMENT SYSTEM FOR KYAMATU PRIMARY SCHOOL</w:t>
+        <w:t>SCHOOL MANAGEMENT SYSTEM FOR MATUNDU PRIMARY SCHOOL</w:t>
       </w:r>
     </w:p>
     <w:p/>
@@ -180,7 +180,7 @@
     </w:p>
     <w:p>
       <w:r>
-        <w:t>Kyamatu Primary School, situated in Voo, Kitui County, provides foundational education under Kenya's Competency-Based Curriculum (CBC) framework. The institution's daily operations—ranging from student enrollment and curriculum tracking to financial management—are highly data-intensive. Currently, the administration relies exclusively on conventional paper-based registries. Student admission records, attendance sheets, and academic grading matrices are curated in physical files, while the bursar's office manages school levies via manual ledgers and receipt books. This traditional paradigm significantly impacts the speed and transparency of administrative workflows, limiting the school's ability to provide timely academic and financial feedback to parents.</w:t>
+        <w:t>Matundu Primary School, situated in Voo, Kitui County, provides foundational education under Kenya's Competency-Based Curriculum (CBC) framework. The institution's daily operations—ranging from student enrollment and curriculum tracking to financial management—are highly data-intensive. Currently, the administration relies exclusively on conventional paper-based registries. Student admission records, attendance sheets, and academic grading matrices are curated in physical files, while the bursar's office manages school levies via manual ledgers and receipt books. This traditional paradigm significantly impacts the speed and transparency of administrative workflows, limiting the school's ability to provide timely academic and financial feedback to parents.</w:t>
       </w:r>
     </w:p>
     <w:p>
@@ -193,7 +193,7 @@
     </w:p>
     <w:p>
       <w:r>
-        <w:t>The continued use of manual, paper-based administrative systems at Kyamatu Primary School creates severe operational bottlenecks and data vulnerabilities. Physical records are highly susceptible to loss, damage, and illicit alteration. Administrators and teaching staff spend an estimated 30% of their working hours manually transcribing attendance sheets, computing CBC competency grades (Exceeding, Meeting, Approaching, or Below Expectations), and reconciling fee balances.</w:t>
+        <w:t>The continued use of manual, paper-based administrative systems at Matundu Primary School creates severe operational bottlenecks and data vulnerabilities. Physical records are highly susceptible to loss, damage, and illicit alteration. Administrators and teaching staff spend an estimated 30% of their working hours manually transcribing attendance sheets, computing CBC competency grades (Exceeding, Meeting, Approaching, or Below Expectations), and reconciling fee balances.</w:t>
       </w:r>
     </w:p>
     <w:p>
@@ -211,7 +211,7 @@
     </w:p>
     <w:p>
       <w:r>
-        <w:t>The proposed solution is a robust, modular, web-based School Management System tailored explicitly for Kyamatu Primary School. This cloud-hosted platform digitizes and integrates core school workflows:</w:t>
+        <w:t>The proposed solution is a robust, modular, web-based School Management System tailored explicitly for Matundu Primary School. This cloud-hosted platform digitizes and integrates core school workflows:</w:t>
       </w:r>
     </w:p>
     <w:p>
@@ -307,7 +307,7 @@
         <w:pStyle w:val="ListBullet"/>
       </w:pPr>
       <w:r>
-        <w:t>To investigate data loss points and administrative delays in current manual systems at Kyamatu Primary School.</w:t>
+        <w:t>To investigate data loss points and administrative delays in current manual systems at Matundu Primary School.</w:t>
       </w:r>
     </w:p>
     <w:p>
@@ -424,7 +424,7 @@
     </w:p>
     <w:p>
       <w:r>
-        <w:t>Target Population: Administrative and teaching corpus of Kyamatu Primary School, alongside a representative subset of the guardian body.</w:t>
+        <w:t>Target Population: Administrative and teaching corpus of Matundu Primary School, alongside a representative subset of the guardian body.</w:t>
       </w:r>
     </w:p>
     <w:p>

</xml_diff>